<commit_message>
Added some UI elements and a UI camera
The current idea with the "main menu" screen is to make it as integrated with the game scene as possible. What I want is that upon pressing a button to start a new game, the game begins in that same scene immediately, with the camera (the son) running up behind the father to establish the correct perspective. This currently needs testing
</commit_message>
<xml_diff>
--- a/Assets/Documentation/Reflective journal Game Poem 2.docx
+++ b/Assets/Documentation/Reflective journal Game Poem 2.docx
@@ -58,7 +58,13 @@
         <w:t>” which d</w:t>
       </w:r>
       <w:r>
-        <w:t>epicts two characters admiring the stars before those stars begin to slowly disappear, signifying that something sinister is about to unfold. The two share a short conversation with one another, sharing knowledge of space and appreciating the beauty of the night sky. This is reinforced in their emotional reactions of tearing up throughout the conversation. I appreciate this emotional response as I often feel the same when I look up at the night sky. I usually take the bins out at an unusually godly hour, but that time of night (or morning…) is so peaceful, with almost no light pollution. It’s at these moments where I just stop and gaze up at the night sky, breathe in the cool night air, and appreciate the stillness that surrounds me. Looking straight up at the night sky evokes a feeling of calmness in me, but also a slight unease as I begin to comprehend the vastness of space. It is incomprehensible and utterly awe inspiring.</w:t>
+        <w:t xml:space="preserve">epicts two characters admiring the stars before those stars begin to slowly disappear, signifying that something sinister is about to unfold. The two share a short conversation with one another, sharing knowledge of space and appreciating the beauty of the night sky. This is reinforced in their emotional reactions of tearing up throughout the conversation. I appreciate this emotional response as I often feel the same when I look up at the night sky. I usually take the bins out at an unusually </w:t>
+      </w:r>
+      <w:r>
+        <w:t>un</w:t>
+      </w:r>
+      <w:r>
+        <w:t>godly hour, but that time of night (or morning…) is so peaceful, with almost no light pollution. It’s at these moments where I just stop and gaze up at the night sky, breathe in the cool night air, and appreciate the stillness that surrounds me. Looking straight up at the night sky evokes a feeling of calmness in me, but also a slight unease as I begin to comprehend the vastness of space. It is incomprehensible and utterly awe inspiring.</w:t>
       </w:r>
     </w:p>
     <w:p>
@@ -125,7 +131,21 @@
           <w:rPr>
             <w:rStyle w:val="Hyperlink"/>
           </w:rPr>
-          <w:t>Goetz, Keltner and Simon-Thomas</w:t>
+          <w:t>Goetz, Keltner and Simon-T</w:t>
+        </w:r>
+        <w:bookmarkStart w:id="0" w:name="_GoBack"/>
+        <w:bookmarkEnd w:id="0"/>
+        <w:r>
+          <w:rPr>
+            <w:rStyle w:val="Hyperlink"/>
+          </w:rPr>
+          <w:t>h</w:t>
+        </w:r>
+        <w:r>
+          <w:rPr>
+            <w:rStyle w:val="Hyperlink"/>
+          </w:rPr>
+          <w:t>omas</w:t>
         </w:r>
       </w:hyperlink>
       <w:r>
@@ -245,6 +265,9 @@
     </w:p>
     <w:p>
       <w:r>
+        <w:rPr>
+          <w:noProof/>
+        </w:rPr>
         <w:drawing>
           <wp:inline distT="0" distB="0" distL="0" distR="0" wp14:anchorId="26661AE8" wp14:editId="26E7AF28">
             <wp:extent cx="5731510" cy="2367915"/>
@@ -292,8 +315,32 @@
       <w:r>
         <w:t>.</w:t>
       </w:r>
-      <w:bookmarkStart w:id="0" w:name="_GoBack"/>
-      <w:bookmarkEnd w:id="0"/>
+    </w:p>
+    <w:p>
+      <w:r>
+        <w:t>11/06/2026 9:19am</w:t>
+      </w:r>
+    </w:p>
+    <w:p>
+      <w:r>
+        <w:t>This morning I have been thinking about how to explicitly design for saudade</w:t>
+      </w:r>
+      <w:r>
+        <w:t xml:space="preserve"> and to integrate this into a moment to moment action. My first thoughts were in relation to tidying the house of the son’s toys scattered on the floor. While this is an action, I also feel like this doesn’t really touch on the idea of desiring something that can no longer exist. Maybe I can instead lean on trying to structure the house on a future that doesn’t exist instead. </w:t>
+      </w:r>
+      <w:proofErr w:type="gramStart"/>
+      <w:r>
+        <w:t>So</w:t>
+      </w:r>
+      <w:proofErr w:type="gramEnd"/>
+      <w:r>
+        <w:t xml:space="preserve"> picking up toys and placing them in a way that’s ready to be played with.</w:t>
+      </w:r>
+    </w:p>
+    <w:p>
+      <w:r>
+        <w:t>“you were the best dad”</w:t>
+      </w:r>
     </w:p>
     <w:sectPr>
       <w:pgSz w:w="11906" w:h="16838"/>
@@ -753,6 +800,18 @@
       <w:shd w:val="clear" w:color="auto" w:fill="E1DFDD"/>
     </w:rPr>
   </w:style>
+  <w:style w:type="character" w:styleId="FollowedHyperlink">
+    <w:name w:val="FollowedHyperlink"/>
+    <w:basedOn w:val="DefaultParagraphFont"/>
+    <w:uiPriority w:val="99"/>
+    <w:semiHidden/>
+    <w:unhideWhenUsed/>
+    <w:rsid w:val="00F14D7B"/>
+    <w:rPr>
+      <w:color w:val="954F72" w:themeColor="followedHyperlink"/>
+      <w:u w:val="single"/>
+    </w:rPr>
+  </w:style>
 </w:styles>
 </file>
 

</xml_diff>

<commit_message>
Prototyped ring descending mechanic
Upon testing my current box lining mechanic to represent pushing, I have redesigned this slightly such that it is now a ring that moves from beyond the screen and into the middle of the screen. The ring starts large and gradually reduces in size until it lines up with a white circle in the middle of the screen. Players must tap the spacebar when the two circles line up with each other. I think this more accurately represents pushing and exerting effort from the perspective of the player character, as the interaction starts from the "first person" camera and moves inward toward the object being pushed. When the player presses spacebar, spectral hands also appear to represent the character's hands reaching out and pushing the object. Design work still needs to be done to truly reflect the effort needed to push a physical object from the spirit world.
</commit_message>
<xml_diff>
--- a/Assets/Documentation/Reflective journal Game Poem 2.docx
+++ b/Assets/Documentation/Reflective journal Game Poem 2.docx
@@ -554,11 +554,12 @@
       <w:r>
         <w:t>To really sell the idea that a child has passed away, I have spent some time mocking up some family photos and spreading them around the house for players to notice. Here is an example screenshot of several:</w:t>
       </w:r>
-      <w:bookmarkStart w:id="0" w:name="_GoBack"/>
-      <w:bookmarkEnd w:id="0"/>
-    </w:p>
-    <w:p>
-      <w:r>
+    </w:p>
+    <w:p>
+      <w:r>
+        <w:rPr>
+          <w:noProof/>
+        </w:rPr>
         <w:lastRenderedPageBreak/>
         <w:drawing>
           <wp:inline distT="0" distB="0" distL="0" distR="0" wp14:anchorId="102DBE52" wp14:editId="7E84F0CB">
@@ -602,6 +603,259 @@
         <w:t>This is also from the player’s perspective, so this is what it would look like in-game.</w:t>
       </w:r>
     </w:p>
+    <w:p>
+      <w:pPr>
+        <w:rPr>
+          <w:b/>
+        </w:rPr>
+      </w:pPr>
+      <w:r>
+        <w:rPr>
+          <w:b/>
+        </w:rPr>
+        <w:t>28/09/2026 13:12</w:t>
+      </w:r>
+    </w:p>
+    <w:p>
+      <w:r>
+        <w:t xml:space="preserve">After a </w:t>
+      </w:r>
+      <w:proofErr w:type="gramStart"/>
+      <w:r>
+        <w:t>2 month</w:t>
+      </w:r>
+      <w:proofErr w:type="gramEnd"/>
+      <w:r>
+        <w:t xml:space="preserve"> hiatus from being on annual leave I’m back developing the game. </w:t>
+      </w:r>
+      <w:r>
+        <w:t xml:space="preserve">The first prototype of pushing a white box toward a desired location is complete. Mechanically and thematically, this works, but I’m left wondering whether the timing approach is enough to convey the struggle of pushing something from another dimension. Repeated tapping could be a way to convey struggle. Additionally, I think I need some visual feedback in the form of hands appearing, as if the player character is reaching out and pushing the object. These hands can be </w:t>
+      </w:r>
+      <w:r>
+        <w:t>ghostly/spectral and will eventually be shown again during the final scene of the game where the player character reaches out to hold their parent’s hands.</w:t>
+      </w:r>
+    </w:p>
+    <w:p>
+      <w:r>
+        <w:t>My first pass on these hands look like this:</w:t>
+      </w:r>
+    </w:p>
+    <w:p>
+      <w:pPr>
+        <w:jc w:val="center"/>
+      </w:pPr>
+      <w:r>
+        <w:rPr>
+          <w:noProof/>
+        </w:rPr>
+        <w:lastRenderedPageBreak/>
+        <w:drawing>
+          <wp:inline distT="0" distB="0" distL="0" distR="0">
+            <wp:extent cx="3921916" cy="3486150"/>
+            <wp:effectExtent l="0" t="0" r="0" b="0"/>
+            <wp:docPr id="5" name="Picture 5"/>
+            <wp:cNvGraphicFramePr>
+              <a:graphicFrameLocks xmlns:a="http://schemas.openxmlformats.org/drawingml/2006/main" noChangeAspect="1"/>
+            </wp:cNvGraphicFramePr>
+            <a:graphic xmlns:a="http://schemas.openxmlformats.org/drawingml/2006/main">
+              <a:graphicData uri="http://schemas.openxmlformats.org/drawingml/2006/picture">
+                <pic:pic xmlns:pic="http://schemas.openxmlformats.org/drawingml/2006/picture">
+                  <pic:nvPicPr>
+                    <pic:cNvPr id="5" name="ghost hands.png"/>
+                    <pic:cNvPicPr/>
+                  </pic:nvPicPr>
+                  <pic:blipFill>
+                    <a:blip r:embed="rId12">
+                      <a:extLst>
+                        <a:ext uri="{28A0092B-C50C-407E-A947-70E740481C1C}">
+                          <a14:useLocalDpi xmlns:a14="http://schemas.microsoft.com/office/drawing/2010/main" val="0"/>
+                        </a:ext>
+                      </a:extLst>
+                    </a:blip>
+                    <a:stretch>
+                      <a:fillRect/>
+                    </a:stretch>
+                  </pic:blipFill>
+                  <pic:spPr>
+                    <a:xfrm>
+                      <a:off x="0" y="0"/>
+                      <a:ext cx="3930555" cy="3493829"/>
+                    </a:xfrm>
+                    <a:prstGeom prst="rect">
+                      <a:avLst/>
+                    </a:prstGeom>
+                  </pic:spPr>
+                </pic:pic>
+              </a:graphicData>
+            </a:graphic>
+          </wp:inline>
+        </w:drawing>
+      </w:r>
+    </w:p>
+    <w:p>
+      <w:r>
+        <w:t>These were created using the GIMP software and I just took my character’s hands, added a glow and lowered the opacity.</w:t>
+      </w:r>
+    </w:p>
+    <w:p>
+      <w:r>
+        <w:t xml:space="preserve">I am currently prototyping a slightly different approach to the push mechanic. Instead of timing a </w:t>
+      </w:r>
+      <w:r>
+        <w:t>rectangle that moves up the screen, I am making it so that a ring slowly descends from outside the screen and into the centre, lining up with a white circle:</w:t>
+      </w:r>
+    </w:p>
+    <w:p>
+      <w:r>
+        <w:drawing>
+          <wp:inline distT="0" distB="0" distL="0" distR="0" wp14:anchorId="415B1435" wp14:editId="11BD26A2">
+            <wp:extent cx="4152900" cy="3846931"/>
+            <wp:effectExtent l="0" t="0" r="0" b="1270"/>
+            <wp:docPr id="6" name="Picture 6"/>
+            <wp:cNvGraphicFramePr>
+              <a:graphicFrameLocks xmlns:a="http://schemas.openxmlformats.org/drawingml/2006/main" noChangeAspect="1"/>
+            </wp:cNvGraphicFramePr>
+            <a:graphic xmlns:a="http://schemas.openxmlformats.org/drawingml/2006/main">
+              <a:graphicData uri="http://schemas.openxmlformats.org/drawingml/2006/picture">
+                <pic:pic xmlns:pic="http://schemas.openxmlformats.org/drawingml/2006/picture">
+                  <pic:nvPicPr>
+                    <pic:cNvPr id="1" name=""/>
+                    <pic:cNvPicPr/>
+                  </pic:nvPicPr>
+                  <pic:blipFill>
+                    <a:blip r:embed="rId13"/>
+                    <a:stretch>
+                      <a:fillRect/>
+                    </a:stretch>
+                  </pic:blipFill>
+                  <pic:spPr>
+                    <a:xfrm>
+                      <a:off x="0" y="0"/>
+                      <a:ext cx="4163174" cy="3856448"/>
+                    </a:xfrm>
+                    <a:prstGeom prst="rect">
+                      <a:avLst/>
+                    </a:prstGeom>
+                  </pic:spPr>
+                </pic:pic>
+              </a:graphicData>
+            </a:graphic>
+          </wp:inline>
+        </w:drawing>
+      </w:r>
+    </w:p>
+    <w:p>
+      <w:r>
+        <w:lastRenderedPageBreak/>
+        <w:t xml:space="preserve">Obvious usability issues aside with the ring colour, this approach more accurately represents pushing from the player character’s perspective. With the added spectral </w:t>
+      </w:r>
+      <w:proofErr w:type="gramStart"/>
+      <w:r>
+        <w:t>hands</w:t>
+      </w:r>
+      <w:proofErr w:type="gramEnd"/>
+      <w:r>
+        <w:t xml:space="preserve"> it looks something like this on button press:</w:t>
+      </w:r>
+    </w:p>
+    <w:p>
+      <w:r>
+        <w:drawing>
+          <wp:inline distT="0" distB="0" distL="0" distR="0" wp14:anchorId="57E8E59C" wp14:editId="2E10C05B">
+            <wp:extent cx="4143953" cy="4544059"/>
+            <wp:effectExtent l="0" t="0" r="9525" b="9525"/>
+            <wp:docPr id="7" name="Picture 7"/>
+            <wp:cNvGraphicFramePr>
+              <a:graphicFrameLocks xmlns:a="http://schemas.openxmlformats.org/drawingml/2006/main" noChangeAspect="1"/>
+            </wp:cNvGraphicFramePr>
+            <a:graphic xmlns:a="http://schemas.openxmlformats.org/drawingml/2006/main">
+              <a:graphicData uri="http://schemas.openxmlformats.org/drawingml/2006/picture">
+                <pic:pic xmlns:pic="http://schemas.openxmlformats.org/drawingml/2006/picture">
+                  <pic:nvPicPr>
+                    <pic:cNvPr id="1" name=""/>
+                    <pic:cNvPicPr/>
+                  </pic:nvPicPr>
+                  <pic:blipFill>
+                    <a:blip r:embed="rId14"/>
+                    <a:stretch>
+                      <a:fillRect/>
+                    </a:stretch>
+                  </pic:blipFill>
+                  <pic:spPr>
+                    <a:xfrm>
+                      <a:off x="0" y="0"/>
+                      <a:ext cx="4143953" cy="4544059"/>
+                    </a:xfrm>
+                    <a:prstGeom prst="rect">
+                      <a:avLst/>
+                    </a:prstGeom>
+                  </pic:spPr>
+                </pic:pic>
+              </a:graphicData>
+            </a:graphic>
+          </wp:inline>
+        </w:drawing>
+      </w:r>
+    </w:p>
+    <w:p>
+      <w:bookmarkStart w:id="0" w:name="_GoBack"/>
+      <w:bookmarkEnd w:id="0"/>
+    </w:p>
+    <w:p>
+      <w:r>
+        <w:t>Below is a photo I took of my colleague’s design thoughts when I spoke with him initially, and these helped to frame the game’s first iteration moving forward:</w:t>
+      </w:r>
+    </w:p>
+    <w:p>
+      <w:r>
+        <w:rPr>
+          <w:noProof/>
+        </w:rPr>
+        <w:lastRenderedPageBreak/>
+        <w:drawing>
+          <wp:inline distT="0" distB="0" distL="0" distR="0">
+            <wp:extent cx="5731510" cy="8107045"/>
+            <wp:effectExtent l="0" t="0" r="2540" b="8255"/>
+            <wp:docPr id="3" name="Picture 3"/>
+            <wp:cNvGraphicFramePr>
+              <a:graphicFrameLocks xmlns:a="http://schemas.openxmlformats.org/drawingml/2006/main" noChangeAspect="1"/>
+            </wp:cNvGraphicFramePr>
+            <a:graphic xmlns:a="http://schemas.openxmlformats.org/drawingml/2006/main">
+              <a:graphicData uri="http://schemas.openxmlformats.org/drawingml/2006/picture">
+                <pic:pic xmlns:pic="http://schemas.openxmlformats.org/drawingml/2006/picture">
+                  <pic:nvPicPr>
+                    <pic:cNvPr id="3" name="Design notes.png"/>
+                    <pic:cNvPicPr/>
+                  </pic:nvPicPr>
+                  <pic:blipFill>
+                    <a:blip r:embed="rId15">
+                      <a:extLst>
+                        <a:ext uri="{28A0092B-C50C-407E-A947-70E740481C1C}">
+                          <a14:useLocalDpi xmlns:a14="http://schemas.microsoft.com/office/drawing/2010/main" val="0"/>
+                        </a:ext>
+                      </a:extLst>
+                    </a:blip>
+                    <a:stretch>
+                      <a:fillRect/>
+                    </a:stretch>
+                  </pic:blipFill>
+                  <pic:spPr>
+                    <a:xfrm>
+                      <a:off x="0" y="0"/>
+                      <a:ext cx="5731510" cy="8107045"/>
+                    </a:xfrm>
+                    <a:prstGeom prst="rect">
+                      <a:avLst/>
+                    </a:prstGeom>
+                  </pic:spPr>
+                </pic:pic>
+              </a:graphicData>
+            </a:graphic>
+          </wp:inline>
+        </w:drawing>
+      </w:r>
+    </w:p>
+    <w:p/>
     <w:sectPr>
       <w:pgSz w:w="11906" w:h="16838"/>
       <w:pgMar w:top="1440" w:right="1440" w:bottom="1440" w:left="1440" w:header="708" w:footer="708" w:gutter="0"/>

</xml_diff>